<commit_message>
Overhaul CV; promote MMS to actual current venture because it is.
</commit_message>
<xml_diff>
--- a/dist/Levi_Skye_Morris_CV.docx
+++ b/dist/Levi_Skye_Morris_CV.docx
@@ -35,7 +35,7 @@
           <w:sz w:val="20"/>
           <w:szCs w:val="20"/>
         </w:rPr>
-        <w:t>Engineering Leader | Staff / Principal Engineer | Payments, Data &amp; Platform Systems</w:t>
+        <w:t>Engineering Leader | Staff / Principal Engineer | Former CTO</w:t>
       </w:r>
     </w:p>
     <w:p>
@@ -89,7 +89,23 @@
           <w:sz w:val="20"/>
           <w:szCs w:val="20"/>
         </w:rPr>
-        <w:t>Hands-on engineering leader and former CTO with 11+ years building ledgers, payment gateways and compliant distributed systems. Led up to 20 engineers across five countries, owning hiring, coaching and performance management, while still operating as the principal engineer on a high-risk payments platform with its own ledger, KYC/AML and on-chain plus fiat settlement rails, kept at 99.9% uptime through banking loss and persistent attacks.</w:t>
+        <w:t xml:space="preserve">Hands-on engineering leader and former CTO with </w:t>
+      </w:r>
+      <w:r>
+        <w:rPr/>
+        <w:t>11+ years building compliant, data-intensive systems across health care, e-commerce, payments and geospatial domains</w:t>
+      </w:r>
+      <w:r>
+        <w:rPr>
+          <w:rFonts w:eastAsia="Calibri" w:cs="Calibri"/>
+          <w:sz w:val="20"/>
+          <w:szCs w:val="20"/>
+        </w:rPr>
+        <w:t>. Led up to 20 engineers across five countries, owning hiring, coaching and performance management, while still operating as the principal engineer on a high-risk payments platform with its own ledger, KYC/AML and on-chain plus fiat settlement rails, kept at 99.9% uptime through banking loss and persistent attacks. Currently</w:t>
+      </w:r>
+      <w:r>
+        <w:rPr/>
+        <w:t xml:space="preserve"> building wildfire-risk assessment tools using PostGIS, UAV photogrammetry and local LLM pipelines.</w:t>
       </w:r>
     </w:p>
     <w:p>
@@ -106,15 +122,15 @@
           <w:sz w:val="20"/>
           <w:szCs w:val="20"/>
         </w:rPr>
-        <w:t xml:space="preserve">Core stack: </w:t>
-      </w:r>
-      <w:r>
-        <w:rPr>
-          <w:rFonts w:eastAsia="Calibri" w:cs="Calibri"/>
-          <w:sz w:val="20"/>
-          <w:szCs w:val="20"/>
-        </w:rPr>
-        <w:t>TypeScript, Python, Java, Kotlin, Clojure, PostgreSQL, PostGIS, Django, NestJS, AWS, GCP, Kubernetes, Terraform</w:t>
+        <w:t>Core Technologies:</w:t>
+      </w:r>
+      <w:r>
+        <w:rPr>
+          <w:rFonts w:eastAsia="Calibri" w:cs="Calibri"/>
+          <w:sz w:val="20"/>
+          <w:szCs w:val="20"/>
+        </w:rPr>
+        <w:t xml:space="preserve"> Python, Java, Kotlin, Clojure, TypeScript, React, Django, NestJS, PostgreSQL, PostGIS, AWS, GCP, Kubernetes</w:t>
       </w:r>
     </w:p>
     <w:p>
@@ -151,15 +167,15 @@
           <w:sz w:val="22"/>
           <w:szCs w:val="22"/>
         </w:rPr>
-        <w:t>SpankChain</w:t>
-      </w:r>
-      <w:r>
-        <w:rPr>
-          <w:rFonts w:eastAsia="Calibri" w:cs="Calibri"/>
-          <w:sz w:val="20"/>
-          <w:szCs w:val="20"/>
-        </w:rPr>
-        <w:t xml:space="preserve">  |  Remote</w:t>
+        <w:t>Morris Mitigation Services, LLC</w:t>
+      </w:r>
+      <w:r>
+        <w:rPr>
+          <w:rFonts w:eastAsia="Calibri" w:cs="Calibri"/>
+          <w:sz w:val="20"/>
+          <w:szCs w:val="20"/>
+        </w:rPr>
+        <w:t xml:space="preserve">  |  Boulder County, Colorado</w:t>
       </w:r>
     </w:p>
     <w:p>
@@ -176,65 +192,15 @@
           <w:sz w:val="20"/>
           <w:szCs w:val="20"/>
         </w:rPr>
-        <w:t>Chief Technology Officer / Principal Engineer</w:t>
-      </w:r>
-      <w:r>
-        <w:rPr>
-          <w:rFonts w:eastAsia="Calibri" w:cs="Calibri"/>
-          <w:sz w:val="20"/>
-          <w:szCs w:val="20"/>
-        </w:rPr>
-        <w:t xml:space="preserve"> |  Jul 2020–Apr 2026</w:t>
-      </w:r>
-    </w:p>
-    <w:p>
-      <w:pPr>
-        <w:pStyle w:val="Normal"/>
-        <w:spacing w:before="0" w:after="20"/>
-        <w:rPr/>
-      </w:pPr>
-      <w:r>
-        <w:rPr>
-          <w:rFonts w:eastAsia="Calibri" w:cs="Calibri"/>
-          <w:b/>
-          <w:bCs/>
-          <w:sz w:val="20"/>
-          <w:szCs w:val="20"/>
-        </w:rPr>
-        <w:t>Acting Head of Engineering</w:t>
-      </w:r>
-      <w:r>
-        <w:rPr>
-          <w:rFonts w:eastAsia="Calibri" w:cs="Calibri"/>
-          <w:sz w:val="20"/>
-          <w:szCs w:val="20"/>
-        </w:rPr>
-        <w:t xml:space="preserve">  |  Dec 2019–Jul 2020</w:t>
-      </w:r>
-    </w:p>
-    <w:p>
-      <w:pPr>
-        <w:pStyle w:val="Normal"/>
-        <w:spacing w:before="0" w:after="20"/>
-        <w:rPr/>
-      </w:pPr>
-      <w:r>
-        <w:rPr>
-          <w:rFonts w:eastAsia="Calibri" w:cs="Calibri"/>
-          <w:b/>
-          <w:bCs/>
-          <w:sz w:val="20"/>
-          <w:szCs w:val="20"/>
-        </w:rPr>
-        <w:t>Senior Software Engineer</w:t>
-      </w:r>
-      <w:r>
-        <w:rPr>
-          <w:rFonts w:eastAsia="Calibri" w:cs="Calibri"/>
-          <w:sz w:val="20"/>
-          <w:szCs w:val="20"/>
-        </w:rPr>
-        <w:t xml:space="preserve">  |  Apr 2019–Dec 2019</w:t>
+        <w:t>Founder &amp; Principal Engineer</w:t>
+      </w:r>
+      <w:r>
+        <w:rPr>
+          <w:rFonts w:eastAsia="Calibri" w:cs="Calibri"/>
+          <w:sz w:val="20"/>
+          <w:szCs w:val="20"/>
+        </w:rPr>
+        <w:t xml:space="preserve">  |  Feb 2026–Present</w:t>
       </w:r>
     </w:p>
     <w:p>
@@ -251,7 +217,7 @@
           <w:sz w:val="20"/>
           <w:szCs w:val="20"/>
         </w:rPr>
-        <w:t>High-risk payment processor for independent creators with its own ledger, KYC/AML and crypto plus fiat settlement rails.</w:t>
+        <w:t>Traditional and UAV-based wildfire-risk assessment and mitigation platform.</w:t>
       </w:r>
     </w:p>
     <w:p>
@@ -270,7 +236,7 @@
           <w:sz w:val="20"/>
           <w:szCs w:val="20"/>
         </w:rPr>
-        <w:t>Architected and led the rebuild of SpankPay v2, the company's ledger and payments platform, storing an opening balance on every transaction for fast, auditable balances.</w:t>
+        <w:t>Architecting, building and maintaining WUIXpose, an open-source Django/PostGIS/React platform that ingests county-level property and structure data and maps home ignition zones, serving as the frontend where assessors and property owners record mitigation assessments in the field.</w:t>
       </w:r>
     </w:p>
     <w:p>
@@ -289,7 +255,7 @@
           <w:sz w:val="20"/>
           <w:szCs w:val="20"/>
         </w:rPr>
-        <w:t>Kept balances correct under concurrent writes with explicit locks and serializable transactions; planned hot-account splitting and migrated balances via snapshot and backfill.</w:t>
+        <w:t>Serves map data as PostGIS vector tiles to a MapLibre frontend; database triggers keep incremental jobs correct as geometry changes.</w:t>
       </w:r>
     </w:p>
     <w:p>
@@ -300,69 +266,15 @@
           <w:numId w:val="1"/>
         </w:numPr>
         <w:spacing w:before="0" w:after="30"/>
-        <w:rPr>
-          <w:rFonts w:eastAsia="Calibri" w:cs="Calibri"/>
-          <w:sz w:val="20"/>
-          <w:szCs w:val="20"/>
-        </w:rPr>
-      </w:pPr>
-      <w:r>
-        <w:rPr>
-          <w:rFonts w:eastAsia="Calibri" w:cs="Calibri"/>
-          <w:sz w:val="20"/>
-          <w:szCs w:val="20"/>
-        </w:rPr>
-        <w:t xml:space="preserve">Secured </w:t>
-      </w:r>
-      <w:r>
-        <w:rPr>
-          <w:rStyle w:val="Strong"/>
-          <w:rFonts w:eastAsia="Calibri" w:cs="Calibri"/>
-          <w:b w:val="false"/>
-          <w:bCs w:val="false"/>
-          <w:sz w:val="20"/>
-          <w:szCs w:val="20"/>
-        </w:rPr>
-        <w:t>digital asset custody, payments infrastructure</w:t>
-      </w:r>
-      <w:r>
-        <w:rPr>
-          <w:rFonts w:eastAsia="Calibri" w:cs="Calibri"/>
-          <w:sz w:val="20"/>
-          <w:szCs w:val="20"/>
-        </w:rPr>
-        <w:t xml:space="preserve"> and signing keys against persistent, well-resourced attackers, with most funds held in </w:t>
-      </w:r>
-      <w:r>
-        <w:rPr>
-          <w:rStyle w:val="Strong"/>
-          <w:rFonts w:eastAsia="Calibri" w:cs="Calibri"/>
-          <w:b w:val="false"/>
-          <w:bCs w:val="false"/>
-          <w:sz w:val="20"/>
-          <w:szCs w:val="20"/>
-        </w:rPr>
-        <w:t>cold</w:t>
-      </w:r>
-      <w:r>
-        <w:rPr>
-          <w:rStyle w:val="Strong"/>
-          <w:rFonts w:eastAsia="Calibri" w:cs="Calibri"/>
-          <w:sz w:val="20"/>
-          <w:szCs w:val="20"/>
-        </w:rPr>
-        <w:t xml:space="preserve"> </w:t>
-      </w:r>
-      <w:r>
-        <w:rPr>
-          <w:rStyle w:val="Strong"/>
-          <w:rFonts w:eastAsia="Calibri" w:cs="Calibri"/>
-          <w:b w:val="false"/>
-          <w:bCs w:val="false"/>
-          <w:sz w:val="20"/>
-          <w:szCs w:val="20"/>
-        </w:rPr>
-        <w:t>storage.</w:t>
+        <w:rPr/>
+      </w:pPr>
+      <w:r>
+        <w:rPr>
+          <w:rFonts w:eastAsia="Calibri" w:cs="Calibri"/>
+          <w:sz w:val="20"/>
+          <w:szCs w:val="20"/>
+        </w:rPr>
+        <w:t>Developing a field-assessment-to-report pipeline: constrained LLM processing of field data on self-hosted models to preserve property-owner privacy, generating final WeasyPrint PDF reports that integrate photographic and narrative evidence.</w:t>
       </w:r>
     </w:p>
     <w:p>
@@ -381,7 +293,7 @@
           <w:sz w:val="20"/>
           <w:szCs w:val="20"/>
         </w:rPr>
-        <w:t>Architected SpankPay.me, keeping independent creators paid after mainstream platforms dropped them.</w:t>
+        <w:t>Developing ground and UAV photogrammetry workflows for parcel-level assessment against NFPA 1140 and IBHS standards. Exploring multispectral UAV data for vegetation health analysis and targeted intervention recommendations.</w:t>
       </w:r>
     </w:p>
     <w:p>
@@ -392,15 +304,19 @@
           <w:numId w:val="1"/>
         </w:numPr>
         <w:spacing w:before="0" w:after="30"/>
-        <w:rPr/>
-      </w:pPr>
-      <w:r>
-        <w:rPr>
-          <w:rFonts w:eastAsia="Calibri" w:cs="Calibri"/>
-          <w:sz w:val="20"/>
-          <w:szCs w:val="20"/>
-        </w:rPr>
-        <w:t>Maintained 99.9% uptime through the loss of banking partners; retained 80% of the core team through a product sunset.</w:t>
+        <w:rPr>
+          <w:rFonts w:eastAsia="Calibri" w:cs="Calibri"/>
+          <w:sz w:val="20"/>
+          <w:szCs w:val="20"/>
+        </w:rPr>
+      </w:pPr>
+      <w:r>
+        <w:rPr>
+          <w:rFonts w:eastAsia="Calibri" w:cs="Calibri"/>
+          <w:sz w:val="20"/>
+          <w:szCs w:val="20"/>
+        </w:rPr>
+        <w:t>Operating a local inference cluster for private data processing and reporting, using LiteLLM to route between open-weight and frontier models.</w:t>
       </w:r>
     </w:p>
     <w:p>
@@ -418,58 +334,12 @@
         </w:rPr>
       </w:pPr>
       <w:r>
-        <w:rPr/>
-        <w:t>Led up to 20 engineers across five countries; mentored multiple bootcamp graduates to full productivity across the stack, from infra/platform to frontend, within a quarter of hire.</w:t>
-      </w:r>
-    </w:p>
-    <w:p>
-      <w:pPr>
-        <w:pStyle w:val="Normal"/>
-        <w:spacing w:before="90" w:after="10"/>
-        <w:rPr/>
-      </w:pPr>
-      <w:r>
-        <w:rPr>
-          <w:rFonts w:eastAsia="Calibri" w:cs="Calibri"/>
-          <w:b/>
-          <w:bCs/>
-          <w:sz w:val="22"/>
-          <w:szCs w:val="22"/>
-        </w:rPr>
-        <w:t>CampSpot</w:t>
-      </w:r>
-      <w:r>
-        <w:rPr>
-          <w:rFonts w:eastAsia="Calibri" w:cs="Calibri"/>
-          <w:sz w:val="20"/>
-          <w:szCs w:val="20"/>
-        </w:rPr>
-        <w:t xml:space="preserve">  |  Denver, Colorado</w:t>
-      </w:r>
-    </w:p>
-    <w:p>
-      <w:pPr>
-        <w:pStyle w:val="Normal"/>
-        <w:spacing w:before="0" w:after="20"/>
-        <w:rPr/>
-      </w:pPr>
-      <w:r>
-        <w:rPr>
-          <w:rFonts w:eastAsia="Calibri" w:cs="Calibri"/>
-          <w:b/>
-          <w:bCs/>
-          <w:sz w:val="20"/>
-          <w:szCs w:val="20"/>
-        </w:rPr>
-        <w:t>Senior Software Engineer</w:t>
-      </w:r>
-      <w:r>
-        <w:rPr>
-          <w:rFonts w:eastAsia="Calibri" w:cs="Calibri"/>
-          <w:sz w:val="20"/>
-          <w:szCs w:val="20"/>
-        </w:rPr>
-        <w:t xml:space="preserve">  |  Sep 2017–Feb 2019</w:t>
+        <w:rPr>
+          <w:rFonts w:eastAsia="Calibri" w:cs="Calibri"/>
+          <w:sz w:val="20"/>
+          <w:szCs w:val="20"/>
+        </w:rPr>
+        <w:t>Designed a solar-powered mesh sensor network for early ignition detection, with edge compute at the perimeter offloading heavy inference loads from low-power nodes.</w:t>
       </w:r>
     </w:p>
     <w:p>
@@ -483,12 +353,147 @@
         <w:rPr/>
       </w:pPr>
       <w:r>
-        <w:rPr>
-          <w:rFonts w:eastAsia="Calibri" w:cs="Calibri"/>
-          <w:sz w:val="20"/>
-          <w:szCs w:val="20"/>
-        </w:rPr>
-        <w:t>Led a three-person payments team; built a PCI DSS Level 1 payment gateway in Kotlin/Dropwizard/PostgreSQL with AES-256 encryption of cardholder data.</w:t>
+        <w:rPr/>
+        <w:t>Performed market research</w:t>
+      </w:r>
+      <w:r>
+        <w:rPr/>
+        <w:t xml:space="preserve"> with realtors, land developers and insurance professionals </w:t>
+      </w:r>
+      <w:r>
+        <w:rPr/>
+        <w:t>to gather requirements and assess market viability.</w:t>
+      </w:r>
+    </w:p>
+    <w:p>
+      <w:pPr>
+        <w:pStyle w:val="Normal"/>
+        <w:spacing w:before="90" w:after="10"/>
+        <w:rPr/>
+      </w:pPr>
+      <w:r>
+        <w:rPr>
+          <w:rFonts w:eastAsia="Calibri" w:cs="Calibri"/>
+          <w:b/>
+          <w:bCs/>
+          <w:sz w:val="22"/>
+          <w:szCs w:val="22"/>
+        </w:rPr>
+        <w:t>SpankChain</w:t>
+      </w:r>
+      <w:r>
+        <w:rPr>
+          <w:rFonts w:eastAsia="Calibri" w:cs="Calibri"/>
+          <w:sz w:val="20"/>
+          <w:szCs w:val="20"/>
+        </w:rPr>
+        <w:t xml:space="preserve">  |  Remote</w:t>
+      </w:r>
+    </w:p>
+    <w:p>
+      <w:pPr>
+        <w:pStyle w:val="Normal"/>
+        <w:spacing w:before="0" w:after="20"/>
+        <w:rPr/>
+      </w:pPr>
+      <w:r>
+        <w:rPr>
+          <w:rFonts w:eastAsia="Calibri" w:cs="Calibri"/>
+          <w:b/>
+          <w:bCs/>
+          <w:sz w:val="20"/>
+          <w:szCs w:val="20"/>
+        </w:rPr>
+        <w:t>Chief Technology Officer / Principal Engineer</w:t>
+      </w:r>
+      <w:r>
+        <w:rPr>
+          <w:rFonts w:eastAsia="Calibri" w:cs="Calibri"/>
+          <w:sz w:val="20"/>
+          <w:szCs w:val="20"/>
+        </w:rPr>
+        <w:t xml:space="preserve"> |  Jul 2020–Apr 2026</w:t>
+      </w:r>
+    </w:p>
+    <w:p>
+      <w:pPr>
+        <w:pStyle w:val="Normal"/>
+        <w:spacing w:before="0" w:after="20"/>
+        <w:rPr/>
+      </w:pPr>
+      <w:r>
+        <w:rPr>
+          <w:rFonts w:eastAsia="Calibri" w:cs="Calibri"/>
+          <w:b/>
+          <w:bCs/>
+          <w:sz w:val="20"/>
+          <w:szCs w:val="20"/>
+        </w:rPr>
+        <w:t>Acting Head of Engineering</w:t>
+      </w:r>
+      <w:r>
+        <w:rPr>
+          <w:rFonts w:eastAsia="Calibri" w:cs="Calibri"/>
+          <w:sz w:val="20"/>
+          <w:szCs w:val="20"/>
+        </w:rPr>
+        <w:t xml:space="preserve">  |  Dec 2019–Jul 2020</w:t>
+      </w:r>
+    </w:p>
+    <w:p>
+      <w:pPr>
+        <w:pStyle w:val="Normal"/>
+        <w:spacing w:before="0" w:after="20"/>
+        <w:rPr/>
+      </w:pPr>
+      <w:r>
+        <w:rPr>
+          <w:rFonts w:eastAsia="Calibri" w:cs="Calibri"/>
+          <w:b/>
+          <w:bCs/>
+          <w:sz w:val="20"/>
+          <w:szCs w:val="20"/>
+        </w:rPr>
+        <w:t>Senior Software Engineer</w:t>
+      </w:r>
+      <w:r>
+        <w:rPr>
+          <w:rFonts w:eastAsia="Calibri" w:cs="Calibri"/>
+          <w:sz w:val="20"/>
+          <w:szCs w:val="20"/>
+        </w:rPr>
+        <w:t xml:space="preserve">  |  Apr 2019–Dec 2019</w:t>
+      </w:r>
+    </w:p>
+    <w:p>
+      <w:pPr>
+        <w:pStyle w:val="Normal"/>
+        <w:spacing w:before="0" w:after="30"/>
+        <w:rPr/>
+      </w:pPr>
+      <w:r>
+        <w:rPr>
+          <w:rFonts w:eastAsia="Calibri" w:cs="Calibri"/>
+          <w:i/>
+          <w:iCs/>
+          <w:sz w:val="20"/>
+          <w:szCs w:val="20"/>
+        </w:rPr>
+        <w:t>High-risk payment processor for independent creators with its own ledger, KYC/AML and crypto plus fiat settlement rails.</w:t>
+      </w:r>
+    </w:p>
+    <w:p>
+      <w:pPr>
+        <w:pStyle w:val="ListParagraph"/>
+        <w:numPr>
+          <w:ilvl w:val="0"/>
+          <w:numId w:val="1"/>
+        </w:numPr>
+        <w:rPr/>
+      </w:pPr>
+      <w:r>
+        <w:rPr/>
+        <w:t>Architected and led SpankPay v2, the ground-up rebuild of the company's core ledger and payments platform supporting both fiat and crypto transaction flows, and SpankPay.me, which kept independent creators paid after mainstream platforms dropped them.</w:t>
       </w:r>
     </w:p>
     <w:p>
@@ -507,57 +512,19 @@
           <w:sz w:val="20"/>
           <w:szCs w:val="20"/>
         </w:rPr>
-        <w:t>Built reservation and payment systems in Java, Kotlin, TypeScript, Node.js and React on AWS.</w:t>
-      </w:r>
-    </w:p>
-    <w:p>
-      <w:pPr>
-        <w:pStyle w:val="Normal"/>
-        <w:spacing w:before="90" w:after="10"/>
-        <w:rPr/>
-      </w:pPr>
-      <w:r>
-        <w:rPr>
-          <w:rFonts w:eastAsia="Calibri" w:cs="Calibri"/>
-          <w:b/>
-          <w:bCs/>
-          <w:sz w:val="22"/>
-          <w:szCs w:val="22"/>
-        </w:rPr>
-        <w:t>DocNetwork / CampDoc</w:t>
-      </w:r>
-      <w:r>
-        <w:rPr>
-          <w:rFonts w:eastAsia="Calibri" w:cs="Calibri"/>
-          <w:sz w:val="20"/>
-          <w:szCs w:val="20"/>
-        </w:rPr>
-        <w:t xml:space="preserve">  |  Ann Arbor, Michigan</w:t>
-      </w:r>
-    </w:p>
-    <w:p>
-      <w:pPr>
-        <w:pStyle w:val="Normal"/>
-        <w:spacing w:before="0" w:after="20"/>
-        <w:rPr/>
-      </w:pPr>
-      <w:r>
-        <w:rPr>
-          <w:rFonts w:eastAsia="Calibri" w:cs="Calibri"/>
-          <w:b/>
-          <w:bCs/>
-          <w:sz w:val="20"/>
-          <w:szCs w:val="20"/>
-        </w:rPr>
-        <w:t>Development Team Lead</w:t>
-      </w:r>
-      <w:r>
-        <w:rPr>
-          <w:rFonts w:eastAsia="Calibri" w:cs="Calibri"/>
-          <w:sz w:val="20"/>
-          <w:szCs w:val="20"/>
-        </w:rPr>
-        <w:t xml:space="preserve">  |  Aug 2015–Jun 2017</w:t>
+        <w:t xml:space="preserve">Kept balances correct under concurrent writes with </w:t>
+      </w:r>
+      <w:r>
+        <w:rPr/>
+        <w:t>explicit</w:t>
+      </w:r>
+      <w:r>
+        <w:rPr>
+          <w:rFonts w:eastAsia="Calibri" w:cs="Calibri"/>
+          <w:sz w:val="20"/>
+          <w:szCs w:val="20"/>
+        </w:rPr>
+        <w:t xml:space="preserve"> locks and serializable transactions; planned hot-account splitting and migrated balances via snapshot and backfill.</w:t>
       </w:r>
     </w:p>
     <w:p>
@@ -580,31 +547,76 @@
           <w:sz w:val="20"/>
           <w:szCs w:val="20"/>
         </w:rPr>
-        <w:t xml:space="preserve">Led a 3–5-person team building a HIPAA/FERPA-compliant </w:t>
-      </w:r>
-      <w:r>
-        <w:rPr>
-          <w:rFonts w:eastAsia="Calibri" w:cs="Calibri"/>
-          <w:sz w:val="20"/>
-          <w:szCs w:val="20"/>
-        </w:rPr>
-        <w:t>E</w:t>
-      </w:r>
-      <w:r>
-        <w:rPr>
-          <w:rFonts w:eastAsia="Calibri" w:cs="Calibri"/>
-          <w:sz w:val="20"/>
-          <w:szCs w:val="20"/>
-        </w:rPr>
-        <w:t>HR system</w:t>
-      </w:r>
-      <w:r>
-        <w:rPr>
-          <w:rFonts w:eastAsia="Calibri" w:cs="Calibri"/>
-          <w:sz w:val="20"/>
-          <w:szCs w:val="20"/>
-        </w:rPr>
-        <w:t xml:space="preserve"> on Node.js, PostgreSQL and AWS.</w:t>
+        <w:t xml:space="preserve">Secured </w:t>
+      </w:r>
+      <w:r>
+        <w:rPr>
+          <w:rStyle w:val="Strong"/>
+          <w:rFonts w:eastAsia="Calibri" w:cs="Calibri"/>
+          <w:b w:val="false"/>
+          <w:bCs w:val="false"/>
+          <w:sz w:val="20"/>
+          <w:szCs w:val="20"/>
+        </w:rPr>
+        <w:t>digital asset custody, payments infrastructure</w:t>
+      </w:r>
+      <w:r>
+        <w:rPr>
+          <w:rFonts w:eastAsia="Calibri" w:cs="Calibri"/>
+          <w:sz w:val="20"/>
+          <w:szCs w:val="20"/>
+        </w:rPr>
+        <w:t xml:space="preserve"> and signing keys against persistent, well-resourced attackers, with most funds held in </w:t>
+      </w:r>
+      <w:r>
+        <w:rPr>
+          <w:rStyle w:val="Strong"/>
+          <w:rFonts w:eastAsia="Calibri" w:cs="Calibri"/>
+          <w:b w:val="false"/>
+          <w:bCs w:val="false"/>
+          <w:sz w:val="20"/>
+          <w:szCs w:val="20"/>
+        </w:rPr>
+        <w:t>cold</w:t>
+      </w:r>
+      <w:r>
+        <w:rPr>
+          <w:rStyle w:val="Strong"/>
+          <w:rFonts w:eastAsia="Calibri" w:cs="Calibri"/>
+          <w:sz w:val="20"/>
+          <w:szCs w:val="20"/>
+        </w:rPr>
+        <w:t xml:space="preserve"> </w:t>
+      </w:r>
+      <w:r>
+        <w:rPr>
+          <w:rStyle w:val="Strong"/>
+          <w:rFonts w:eastAsia="Calibri" w:cs="Calibri"/>
+          <w:b w:val="false"/>
+          <w:bCs w:val="false"/>
+          <w:sz w:val="20"/>
+          <w:szCs w:val="20"/>
+        </w:rPr>
+        <w:t>storage.</w:t>
+      </w:r>
+    </w:p>
+    <w:p>
+      <w:pPr>
+        <w:pStyle w:val="ListParagraph"/>
+        <w:numPr>
+          <w:ilvl w:val="0"/>
+          <w:numId w:val="1"/>
+        </w:numPr>
+        <w:rPr/>
+      </w:pPr>
+      <w:r>
+        <w:rPr>
+          <w:rStyle w:val="Strong"/>
+          <w:rFonts w:ascii="Calibri" w:hAnsi="Calibri"/>
+          <w:b w:val="false"/>
+          <w:bCs w:val="false"/>
+        </w:rPr>
+        <w:t>Architected and led the buildout of both versions of SpankMatch, a professional social networking platform for independent creators focused on safety, dignity and safeguarding of user PII.</w:t>
       </w:r>
     </w:p>
     <w:p>
@@ -618,58 +630,12 @@
         <w:rPr/>
       </w:pPr>
       <w:r>
-        <w:rPr/>
-        <w:t>Resolved severe API and PostgreSQL bottlenecks with query-plan analysis, indexing, recursive CTEs and targeted GraphQL endpoints alongside the REST API as monthly payment volume grew from six to seven figures.</w:t>
-      </w:r>
-    </w:p>
-    <w:p>
-      <w:pPr>
-        <w:pStyle w:val="Normal"/>
-        <w:spacing w:before="90" w:after="10"/>
-        <w:rPr/>
-      </w:pPr>
-      <w:r>
-        <w:rPr>
-          <w:rFonts w:eastAsia="Calibri" w:cs="Calibri"/>
-          <w:b/>
-          <w:bCs/>
-          <w:sz w:val="22"/>
-          <w:szCs w:val="22"/>
-        </w:rPr>
-        <w:t>SearchSpring</w:t>
-      </w:r>
-      <w:r>
-        <w:rPr>
-          <w:rFonts w:eastAsia="Calibri" w:cs="Calibri"/>
-          <w:sz w:val="20"/>
-          <w:szCs w:val="20"/>
-        </w:rPr>
-        <w:t xml:space="preserve">  |  Colorado Springs, Colorado</w:t>
-      </w:r>
-    </w:p>
-    <w:p>
-      <w:pPr>
-        <w:pStyle w:val="Normal"/>
-        <w:spacing w:before="0" w:after="20"/>
-        <w:rPr/>
-      </w:pPr>
-      <w:r>
-        <w:rPr>
-          <w:rFonts w:eastAsia="Calibri" w:cs="Calibri"/>
-          <w:b/>
-          <w:bCs/>
-          <w:sz w:val="20"/>
-          <w:szCs w:val="20"/>
-        </w:rPr>
-        <w:t>Integration Specialist</w:t>
-      </w:r>
-      <w:r>
-        <w:rPr>
-          <w:rFonts w:eastAsia="Calibri" w:cs="Calibri"/>
-          <w:sz w:val="20"/>
-          <w:szCs w:val="20"/>
-        </w:rPr>
-        <w:t xml:space="preserve">  |  Nov 2014–Aug 2015</w:t>
+        <w:rPr>
+          <w:rFonts w:eastAsia="Calibri" w:cs="Calibri"/>
+          <w:sz w:val="20"/>
+          <w:szCs w:val="20"/>
+        </w:rPr>
+        <w:t>Maintained 99.9% uptime through the loss of banking partners; retained 80% of the core team through a product sunset.</w:t>
       </w:r>
     </w:p>
     <w:p>
@@ -680,15 +646,15 @@
           <w:numId w:val="1"/>
         </w:numPr>
         <w:spacing w:before="0" w:after="30"/>
-        <w:rPr/>
-      </w:pPr>
-      <w:r>
-        <w:rPr>
-          <w:rFonts w:eastAsia="Calibri" w:cs="Calibri"/>
-          <w:sz w:val="20"/>
-          <w:szCs w:val="20"/>
-        </w:rPr>
-        <w:t>Built e-commerce search integrations for Shopify, Magento, NetSuite and BigCommerce, indexing catalog data into Elasticsearch.</w:t>
+        <w:rPr>
+          <w:rFonts w:eastAsia="Calibri" w:cs="Calibri"/>
+          <w:sz w:val="20"/>
+          <w:szCs w:val="20"/>
+        </w:rPr>
+      </w:pPr>
+      <w:r>
+        <w:rPr/>
+        <w:t>Led up to 20 engineers across five countries; mentored multiple bootcamp graduates to full productivity across the stack, from infra/platform to frontend, within a quarter of hire.</w:t>
       </w:r>
     </w:p>
     <w:p>
@@ -705,15 +671,15 @@
           <w:sz w:val="22"/>
           <w:szCs w:val="22"/>
         </w:rPr>
-        <w:t>Gelada Research Project</w:t>
-      </w:r>
-      <w:r>
-        <w:rPr>
-          <w:rFonts w:eastAsia="Calibri" w:cs="Calibri"/>
-          <w:sz w:val="20"/>
-          <w:szCs w:val="20"/>
-        </w:rPr>
-        <w:t xml:space="preserve">  |  Simien Mountains, Ethiopia</w:t>
+        <w:t>CampSpot</w:t>
+      </w:r>
+      <w:r>
+        <w:rPr>
+          <w:rFonts w:eastAsia="Calibri" w:cs="Calibri"/>
+          <w:sz w:val="20"/>
+          <w:szCs w:val="20"/>
+        </w:rPr>
+        <w:t xml:space="preserve">  |  Denver, Colorado</w:t>
       </w:r>
     </w:p>
     <w:p>
@@ -730,15 +696,15 @@
           <w:sz w:val="20"/>
           <w:szCs w:val="20"/>
         </w:rPr>
-        <w:t>Field Site Manager</w:t>
-      </w:r>
-      <w:r>
-        <w:rPr>
-          <w:rFonts w:eastAsia="Calibri" w:cs="Calibri"/>
-          <w:sz w:val="20"/>
-          <w:szCs w:val="20"/>
-        </w:rPr>
-        <w:t xml:space="preserve">  |  Jun 2012–Jan 2014</w:t>
+        <w:t>Senior Software Engineer</w:t>
+      </w:r>
+      <w:r>
+        <w:rPr>
+          <w:rFonts w:eastAsia="Calibri" w:cs="Calibri"/>
+          <w:sz w:val="20"/>
+          <w:szCs w:val="20"/>
+        </w:rPr>
+        <w:t xml:space="preserve">  |  Sep 2017–Feb 2019</w:t>
       </w:r>
     </w:p>
     <w:p>
@@ -749,81 +715,15 @@
           <w:numId w:val="1"/>
         </w:numPr>
         <w:spacing w:before="0" w:after="30"/>
-        <w:rPr>
-          <w:rFonts w:eastAsia="Calibri" w:cs="Calibri"/>
-          <w:sz w:val="20"/>
-          <w:szCs w:val="20"/>
-        </w:rPr>
-      </w:pPr>
-      <w:r>
-        <w:rPr>
-          <w:rFonts w:eastAsia="Calibri" w:cs="Calibri"/>
-          <w:sz w:val="20"/>
-          <w:szCs w:val="20"/>
-        </w:rPr>
-        <w:t>Ran a remote, high-altitude primate research station and extended its Palm Pilot data-collection software in the field.</w:t>
-      </w:r>
-    </w:p>
-    <w:p>
-      <w:pPr>
-        <w:pStyle w:val="Normal"/>
-        <w:pBdr>
-          <w:bottom w:val="single" w:sz="6" w:space="2" w:color="999999"/>
-        </w:pBdr>
-        <w:spacing w:before="160" w:after="60"/>
-        <w:rPr/>
-      </w:pPr>
-      <w:r>
-        <w:rPr>
-          <w:rFonts w:eastAsia="Calibri" w:cs="Calibri"/>
-          <w:b/>
-          <w:bCs/>
-          <w:sz w:val="22"/>
-          <w:szCs w:val="22"/>
-        </w:rPr>
-        <w:t>PROJECTS</w:t>
-      </w:r>
-    </w:p>
-    <w:p>
-      <w:pPr>
-        <w:pStyle w:val="Normal"/>
-        <w:spacing w:before="90" w:after="10"/>
-        <w:rPr/>
-      </w:pPr>
-      <w:r>
-        <w:rPr>
-          <w:rFonts w:eastAsia="Calibri" w:cs="Calibri"/>
-          <w:b/>
-          <w:bCs/>
-          <w:sz w:val="22"/>
-          <w:szCs w:val="22"/>
-        </w:rPr>
-        <w:t>WUIXpose</w:t>
-      </w:r>
-      <w:r>
-        <w:rPr>
-          <w:rFonts w:eastAsia="Calibri" w:cs="Calibri"/>
-          <w:sz w:val="20"/>
-          <w:szCs w:val="20"/>
-        </w:rPr>
-        <w:t xml:space="preserve">  |  2026</w:t>
-      </w:r>
-    </w:p>
-    <w:p>
-      <w:pPr>
-        <w:pStyle w:val="Normal"/>
-        <w:spacing w:before="0" w:after="20"/>
-        <w:rPr/>
-      </w:pPr>
-      <w:r>
-        <w:rPr>
-          <w:rFonts w:eastAsia="Calibri" w:cs="Calibri"/>
-          <w:b/>
-          <w:bCs/>
-          <w:sz w:val="20"/>
-          <w:szCs w:val="20"/>
-        </w:rPr>
-        <w:t>Open source: Django, PostGIS, React</w:t>
+        <w:rPr/>
+      </w:pPr>
+      <w:r>
+        <w:rPr>
+          <w:rFonts w:eastAsia="Calibri" w:cs="Calibri"/>
+          <w:sz w:val="20"/>
+          <w:szCs w:val="20"/>
+        </w:rPr>
+        <w:t>Led a three-person payments team; built a PCI DSS Level 1 payment gateway in Kotlin/Dropwizard/PostgreSQL with AES-256 encryption of cardholder data.</w:t>
       </w:r>
     </w:p>
     <w:p>
@@ -842,7 +742,79 @@
           <w:sz w:val="20"/>
           <w:szCs w:val="20"/>
         </w:rPr>
-        <w:t>Maps home ignition zones around every structure in Boulder County, served as PostGIS vector tiles to a MapLibre frontend.</w:t>
+        <w:t>Built reservation and payment systems in Java, Kotlin, TypeScript, Node.js and React on AWS.</w:t>
+      </w:r>
+    </w:p>
+    <w:p>
+      <w:pPr>
+        <w:pStyle w:val="Normal"/>
+        <w:spacing w:before="90" w:after="10"/>
+        <w:rPr>
+          <w:rFonts w:eastAsia="Calibri" w:cs="Calibri"/>
+          <w:b/>
+          <w:bCs/>
+          <w:sz w:val="22"/>
+          <w:szCs w:val="22"/>
+        </w:rPr>
+      </w:pPr>
+      <w:r>
+        <w:rPr>
+          <w:rFonts w:eastAsia="Calibri" w:cs="Calibri"/>
+          <w:b/>
+          <w:bCs/>
+          <w:sz w:val="22"/>
+          <w:szCs w:val="22"/>
+        </w:rPr>
+      </w:r>
+    </w:p>
+    <w:p>
+      <w:pPr>
+        <w:pStyle w:val="Normal"/>
+        <w:spacing w:before="90" w:after="10"/>
+        <w:rPr/>
+      </w:pPr>
+      <w:r>
+        <w:rPr>
+          <w:rFonts w:eastAsia="Calibri" w:cs="Calibri"/>
+          <w:b/>
+          <w:bCs/>
+          <w:sz w:val="22"/>
+          <w:szCs w:val="22"/>
+        </w:rPr>
+        <w:t>DocNetwork / CampDoc</w:t>
+      </w:r>
+      <w:r>
+        <w:rPr>
+          <w:rFonts w:eastAsia="Calibri" w:cs="Calibri"/>
+          <w:sz w:val="20"/>
+          <w:szCs w:val="20"/>
+        </w:rPr>
+        <w:t xml:space="preserve">  |  Ann Arbor, Michigan</w:t>
+      </w:r>
+    </w:p>
+    <w:p>
+      <w:pPr>
+        <w:pStyle w:val="Normal"/>
+        <w:spacing w:before="0" w:after="20"/>
+        <w:rPr/>
+      </w:pPr>
+      <w:r>
+        <w:rPr>
+          <w:rFonts w:eastAsia="Calibri" w:cs="Calibri"/>
+          <w:b/>
+          <w:bCs/>
+          <w:sz w:val="20"/>
+          <w:szCs w:val="20"/>
+        </w:rPr>
+        <w:t>Development Team Lead</w:t>
+      </w:r>
+      <w:r>
+        <w:rPr>
+          <w:rFonts w:eastAsia="Calibri" w:cs="Calibri"/>
+          <w:sz w:val="20"/>
+          <w:szCs w:val="20"/>
+        </w:rPr>
+        <w:t xml:space="preserve">  |  Aug 2015–Jun 2017</w:t>
       </w:r>
     </w:p>
     <w:p>
@@ -853,15 +825,181 @@
           <w:numId w:val="1"/>
         </w:numPr>
         <w:spacing w:before="0" w:after="30"/>
-        <w:rPr/>
-      </w:pPr>
-      <w:r>
-        <w:rPr>
-          <w:rFonts w:eastAsia="Calibri" w:cs="Calibri"/>
-          <w:sz w:val="20"/>
-          <w:szCs w:val="20"/>
-        </w:rPr>
-        <w:t>Keeps incremental jobs correct with database triggers that track geometry changes.</w:t>
+        <w:rPr>
+          <w:rFonts w:eastAsia="Calibri" w:cs="Calibri"/>
+          <w:sz w:val="20"/>
+          <w:szCs w:val="20"/>
+        </w:rPr>
+      </w:pPr>
+      <w:r>
+        <w:rPr>
+          <w:rFonts w:eastAsia="Calibri" w:cs="Calibri"/>
+          <w:sz w:val="20"/>
+          <w:szCs w:val="20"/>
+        </w:rPr>
+        <w:t>Led a 3–5-person team building a HIPAA/FERPA-compliant EHR system on Node.js, PostgreSQL and AWS.</w:t>
+      </w:r>
+    </w:p>
+    <w:p>
+      <w:pPr>
+        <w:pStyle w:val="ListParagraph"/>
+        <w:numPr>
+          <w:ilvl w:val="0"/>
+          <w:numId w:val="1"/>
+        </w:numPr>
+        <w:rPr/>
+      </w:pPr>
+      <w:r>
+        <w:rPr/>
+        <w:t>Resolved severe API and PostgreSQL bottlenecks with query-plan analysis, indexing, recursive CTEs and targeted GraphQL endpoints alongside a REST API as monthly payment volume rose from six to seven figures and the customer base grew more than tenfold to include large national and multi-site youth organizations.</w:t>
+      </w:r>
+    </w:p>
+    <w:p>
+      <w:pPr>
+        <w:pStyle w:val="Normal"/>
+        <w:spacing w:before="90" w:after="10"/>
+        <w:rPr/>
+      </w:pPr>
+      <w:r>
+        <w:rPr>
+          <w:rFonts w:eastAsia="Calibri" w:cs="Calibri"/>
+          <w:b/>
+          <w:bCs/>
+          <w:sz w:val="22"/>
+          <w:szCs w:val="22"/>
+        </w:rPr>
+        <w:t>SearchSpring</w:t>
+      </w:r>
+      <w:r>
+        <w:rPr>
+          <w:rFonts w:eastAsia="Calibri" w:cs="Calibri"/>
+          <w:sz w:val="20"/>
+          <w:szCs w:val="20"/>
+        </w:rPr>
+        <w:t xml:space="preserve">  |  Colorado Springs, Colorado</w:t>
+      </w:r>
+    </w:p>
+    <w:p>
+      <w:pPr>
+        <w:pStyle w:val="Normal"/>
+        <w:spacing w:before="0" w:after="20"/>
+        <w:rPr/>
+      </w:pPr>
+      <w:r>
+        <w:rPr>
+          <w:rFonts w:eastAsia="Calibri" w:cs="Calibri"/>
+          <w:b/>
+          <w:bCs/>
+          <w:sz w:val="20"/>
+          <w:szCs w:val="20"/>
+        </w:rPr>
+        <w:t>Integration Specialist</w:t>
+      </w:r>
+      <w:r>
+        <w:rPr>
+          <w:rFonts w:eastAsia="Calibri" w:cs="Calibri"/>
+          <w:sz w:val="20"/>
+          <w:szCs w:val="20"/>
+        </w:rPr>
+        <w:t xml:space="preserve">  |  Nov 2014–Aug 2015</w:t>
+      </w:r>
+    </w:p>
+    <w:p>
+      <w:pPr>
+        <w:pStyle w:val="ListParagraph"/>
+        <w:numPr>
+          <w:ilvl w:val="0"/>
+          <w:numId w:val="1"/>
+        </w:numPr>
+        <w:rPr/>
+      </w:pPr>
+      <w:r>
+        <w:rPr/>
+        <w:t>Built third-party platform integrations for Shopify, Magento, NetSuite and BigCommerce, with pipelines that loaded catalog data into S3 and indexed it into Elasticsearch with custom relevance weighting.</w:t>
+      </w:r>
+    </w:p>
+    <w:p>
+      <w:pPr>
+        <w:pStyle w:val="Normal"/>
+        <w:spacing w:before="90" w:after="10"/>
+        <w:rPr/>
+      </w:pPr>
+      <w:r>
+        <w:rPr>
+          <w:rFonts w:eastAsia="Calibri" w:cs="Calibri"/>
+          <w:b/>
+          <w:bCs/>
+          <w:sz w:val="22"/>
+          <w:szCs w:val="22"/>
+        </w:rPr>
+        <w:t>Gelada Research Project</w:t>
+      </w:r>
+      <w:r>
+        <w:rPr>
+          <w:rFonts w:eastAsia="Calibri" w:cs="Calibri"/>
+          <w:sz w:val="20"/>
+          <w:szCs w:val="20"/>
+        </w:rPr>
+        <w:t xml:space="preserve">  |  Simien Mountains, Ethiopia</w:t>
+      </w:r>
+    </w:p>
+    <w:p>
+      <w:pPr>
+        <w:pStyle w:val="Normal"/>
+        <w:spacing w:before="0" w:after="20"/>
+        <w:rPr/>
+      </w:pPr>
+      <w:r>
+        <w:rPr>
+          <w:rFonts w:eastAsia="Calibri" w:cs="Calibri"/>
+          <w:b/>
+          <w:bCs/>
+          <w:sz w:val="20"/>
+          <w:szCs w:val="20"/>
+        </w:rPr>
+        <w:t>Field Site Manager</w:t>
+      </w:r>
+      <w:r>
+        <w:rPr>
+          <w:rFonts w:eastAsia="Calibri" w:cs="Calibri"/>
+          <w:sz w:val="20"/>
+          <w:szCs w:val="20"/>
+        </w:rPr>
+        <w:t xml:space="preserve">  |  Jun 2012–Jan 2014</w:t>
+      </w:r>
+    </w:p>
+    <w:p>
+      <w:pPr>
+        <w:pStyle w:val="ListParagraph"/>
+        <w:numPr>
+          <w:ilvl w:val="0"/>
+          <w:numId w:val="1"/>
+        </w:numPr>
+        <w:rPr/>
+      </w:pPr>
+      <w:r>
+        <w:rPr/>
+        <w:t>Ran a remote, high-altitude primate research station and extended its Palm Pilot data-collection software in the field.</w:t>
+      </w:r>
+    </w:p>
+    <w:p>
+      <w:pPr>
+        <w:pStyle w:val="Normal"/>
+        <w:pBdr>
+          <w:bottom w:val="single" w:sz="6" w:space="2" w:color="999999"/>
+        </w:pBdr>
+        <w:spacing w:before="160" w:after="60"/>
+        <w:rPr/>
+      </w:pPr>
+      <w:r>
+        <w:rPr>
+          <w:rFonts w:eastAsia="Calibri" w:cs="Calibri"/>
+          <w:b/>
+          <w:bCs/>
+          <w:sz w:val="22"/>
+          <w:szCs w:val="22"/>
+        </w:rPr>
+        <w:t>PROJECTS</w:t>
       </w:r>
     </w:p>
     <w:p>

</xml_diff>